<commit_message>
§XII says the benign corpus is exhausted, not merely wide
The bullet called 60 documents 'adequate but wide', which reads as a sample
that a deeper draw would fix. It is a census: the complete benign content of
AgentDojo v0.1.35's workspace and slack suites under the committed filter,
re-harvested item-for-item from a fresh wheel, with zero disjoint episodes
left. State the two things that follow — that the routes reaching 110 admit
off-domain travel prose carrying no liftable target, and so would lower the
FPR for reasons unrelated to the defense; and that the width comes from a
rate near zero, not from n, so tripling the corpus buys 3.3 points. The
limitation relocates to needing a second external benign corpus.

No measured number moves. The .docx regenerates.
</commit_message>
<xml_diff>
--- a/paper/AdaptiShield-Manuscript.docx
+++ b/paper/AdaptiShield-Manuscript.docx
@@ -10380,17 +10380,177 @@
           <w:color w:val="000000"/>
           <w:sz w:val="20"/>
         </w:rPr>
-        <w:t>The benign corpus is 60 external documents,</w:t>
-      </w:r>
-      <w:r>
-        <w:rPr>
-          <w:rFonts w:ascii="Times New Roman" w:hAnsi="Times New Roman"/>
-          <w:b w:val="0"/>
-          <w:i w:val="0"/>
-          <w:color w:val="000000"/>
-          <w:sz w:val="20"/>
-        </w:rPr>
-        <w:t xml:space="preserve"> adequate for the reported [0.9%, 11.4%] interval but wide enough that a two-point FPR difference is unresolvable.</w:t>
+        <w:t>The benign corpus is 60 external documents, and that is a census rather than a sample.</w:t>
+      </w:r>
+      <w:r>
+        <w:rPr>
+          <w:rFonts w:ascii="Times New Roman" w:hAnsi="Times New Roman"/>
+          <w:b w:val="0"/>
+          <w:i w:val="0"/>
+          <w:color w:val="000000"/>
+          <w:sz w:val="20"/>
+        </w:rPr>
+        <w:t xml:space="preserve"> The 60 are the complete benign content of AgentDojo v0.1.35's </w:t>
+      </w:r>
+      <w:r>
+        <w:rPr>
+          <w:rFonts w:ascii="Consolas" w:hAnsi="Consolas"/>
+          <w:b w:val="0"/>
+          <w:i w:val="0"/>
+          <w:color w:val="000000"/>
+          <w:sz w:val="19"/>
+        </w:rPr>
+        <w:t>workspace</w:t>
+      </w:r>
+      <w:r>
+        <w:rPr>
+          <w:rFonts w:ascii="Times New Roman" w:hAnsi="Times New Roman"/>
+          <w:b w:val="0"/>
+          <w:i w:val="0"/>
+          <w:color w:val="000000"/>
+          <w:sz w:val="20"/>
+        </w:rPr>
+        <w:t xml:space="preserve"> and </w:t>
+      </w:r>
+      <w:r>
+        <w:rPr>
+          <w:rFonts w:ascii="Consolas" w:hAnsi="Consolas"/>
+          <w:b w:val="0"/>
+          <w:i w:val="0"/>
+          <w:color w:val="000000"/>
+          <w:sz w:val="19"/>
+        </w:rPr>
+        <w:t>slack</w:t>
+      </w:r>
+      <w:r>
+        <w:rPr>
+          <w:rFonts w:ascii="Times New Roman" w:hAnsi="Times New Roman"/>
+          <w:b w:val="0"/>
+          <w:i w:val="0"/>
+          <w:color w:val="000000"/>
+          <w:sz w:val="20"/>
+        </w:rPr>
+        <w:t xml:space="preserve"> suites under our committed in-domain filter — re-harvested from a fresh wheel item-for-item, with zero disjoint episodes remaining. Every route to a larger </w:t>
+      </w:r>
+      <w:r>
+        <w:rPr>
+          <w:rFonts w:ascii="Times New Roman" w:hAnsi="Times New Roman"/>
+          <w:b w:val="0"/>
+          <w:i/>
+          <w:color w:val="000000"/>
+          <w:sz w:val="20"/>
+        </w:rPr>
+        <w:t>n</w:t>
+      </w:r>
+      <w:r>
+        <w:rPr>
+          <w:rFonts w:ascii="Times New Roman" w:hAnsi="Times New Roman"/>
+          <w:b w:val="0"/>
+          <w:i w:val="0"/>
+          <w:color w:val="000000"/>
+          <w:sz w:val="20"/>
+        </w:rPr>
+        <w:t xml:space="preserve"> changes the sourcing policy rather than deepening the draw: the only ones reaching 110 admit off-domain </w:t>
+      </w:r>
+      <w:r>
+        <w:rPr>
+          <w:rFonts w:ascii="Consolas" w:hAnsi="Consolas"/>
+          <w:b w:val="0"/>
+          <w:i w:val="0"/>
+          <w:color w:val="000000"/>
+          <w:sz w:val="19"/>
+        </w:rPr>
+        <w:t>travel</w:t>
+      </w:r>
+      <w:r>
+        <w:rPr>
+          <w:rFonts w:ascii="Times New Roman" w:hAnsi="Times New Roman"/>
+          <w:b w:val="0"/>
+          <w:i w:val="0"/>
+          <w:color w:val="000000"/>
+          <w:sz w:val="20"/>
+        </w:rPr>
+        <w:t xml:space="preserve"> reviews, which carry no address or URL an action could name and would therefore lower the measured FPR for reasons unrelated to the defense. Nor would width arrive if they did — at a rate near 3.3% the projected interval narrows from 10.5 points at </w:t>
+      </w:r>
+      <w:r>
+        <w:rPr>
+          <w:rFonts w:ascii="Times New Roman" w:hAnsi="Times New Roman"/>
+          <w:b w:val="0"/>
+          <w:i/>
+          <w:color w:val="000000"/>
+          <w:sz w:val="20"/>
+        </w:rPr>
+        <w:t>n</w:t>
+      </w:r>
+      <w:r>
+        <w:rPr>
+          <w:rFonts w:ascii="Times New Roman" w:hAnsi="Times New Roman"/>
+          <w:b w:val="0"/>
+          <w:i w:val="0"/>
+          <w:color w:val="000000"/>
+          <w:sz w:val="20"/>
+        </w:rPr>
+        <w:t xml:space="preserve">=60 only to 7.2 at </w:t>
+      </w:r>
+      <w:r>
+        <w:rPr>
+          <w:rFonts w:ascii="Times New Roman" w:hAnsi="Times New Roman"/>
+          <w:b w:val="0"/>
+          <w:i/>
+          <w:color w:val="000000"/>
+          <w:sz w:val="20"/>
+        </w:rPr>
+        <w:t>n</w:t>
+      </w:r>
+      <w:r>
+        <w:rPr>
+          <w:rFonts w:ascii="Times New Roman" w:hAnsi="Times New Roman"/>
+          <w:b w:val="0"/>
+          <w:i w:val="0"/>
+          <w:color w:val="000000"/>
+          <w:sz w:val="20"/>
+        </w:rPr>
+        <w:t xml:space="preserve">=115, because the interval is wide where the rate sits near zero, not mainly because </w:t>
+      </w:r>
+      <w:r>
+        <w:rPr>
+          <w:rFonts w:ascii="Times New Roman" w:hAnsi="Times New Roman"/>
+          <w:b w:val="0"/>
+          <w:i/>
+          <w:color w:val="000000"/>
+          <w:sz w:val="20"/>
+        </w:rPr>
+        <w:t>n</w:t>
+      </w:r>
+      <w:r>
+        <w:rPr>
+          <w:rFonts w:ascii="Times New Roman" w:hAnsi="Times New Roman"/>
+          <w:b w:val="0"/>
+          <w:i w:val="0"/>
+          <w:color w:val="000000"/>
+          <w:sz w:val="20"/>
+        </w:rPr>
+        <w:t xml:space="preserve"> is 60. The interval is genuinely wide and a two-point FPR difference remains unresolvable; the limitation is that a </w:t>
+      </w:r>
+      <w:r>
+        <w:rPr>
+          <w:rFonts w:ascii="Times New Roman" w:hAnsi="Times New Roman"/>
+          <w:b w:val="0"/>
+          <w:i/>
+          <w:color w:val="000000"/>
+          <w:sz w:val="20"/>
+        </w:rPr>
+        <w:t>second</w:t>
+      </w:r>
+      <w:r>
+        <w:rPr>
+          <w:rFonts w:ascii="Times New Roman" w:hAnsi="Times New Roman"/>
+          <w:b w:val="0"/>
+          <w:i w:val="0"/>
+          <w:color w:val="000000"/>
+          <w:sz w:val="20"/>
+        </w:rPr>
+        <w:t xml:space="preserve"> external benign corpus is needed, not more of this one.</w:t>
       </w:r>
     </w:p>
     <w:p>

</xml_diff>

<commit_message>
The figure catches up with the XML: re-exported without the five unbuilt boxes
Re-exported from draw.io by hand — there is no CLI on this machine — so the
inconsistency e140331 introduced is closed. Verified by reading the image, not
by trusting the filename: the legend now says every component shown is built
and validated, Layer 0 carries only the Server Trust Registry, Layer 1 only
Input Parser and Context Builder.

The '(1)' duplicate export is deleted rather than re-exported twice; it was a
second copy of the same figure and nothing referenced it. The .docx and the
site's implementation_architecture.png both rebuild from the root PNG and now
carry the new one — md5 identical across all three.

The superseded image is left untracked as a local file rather than committed:
git already holds it in this commit's parent, so a 4 MB second copy buys
nothing.
</commit_message>
<xml_diff>
--- a/paper/AdaptiShield-Manuscript.docx
+++ b/paper/AdaptiShield-Manuscript.docx
@@ -11751,7 +11751,7 @@
       <w:r>
         <w:drawing>
           <wp:inline xmlns:a="http://schemas.openxmlformats.org/drawingml/2006/main" xmlns:pic="http://schemas.openxmlformats.org/drawingml/2006/picture">
-            <wp:extent cx="8229600" cy="3797092"/>
+            <wp:extent cx="8229600" cy="4224554"/>
             <wp:docPr id="6" name="Picture 6"/>
             <wp:cNvGraphicFramePr>
               <a:graphicFrameLocks noChangeAspect="1"/>
@@ -11772,7 +11772,7 @@
                   <pic:spPr>
                     <a:xfrm>
                       <a:off x="0" y="0"/>
-                      <a:ext cx="8229600" cy="3797092"/>
+                      <a:ext cx="8229600" cy="4224554"/>
                     </a:xfrm>
                     <a:prstGeom prst="rect"/>
                   </pic:spPr>

</xml_diff>